<commit_message>
Update Bulong bridge chords
Bridge chords changed from E / G / Cadd9 / G and Cadd9 / G / D to
Bm / G / Em / D/F# and G / A, per the updated source chord sheet.

Co-Authored-By: Claude Sonnet 5 <noreply@anthropic.com>
Claude-Session: https://claude.ai/code/session_01VAaiXhx9wytCGGEnHUzCxJ
</commit_message>
<xml_diff>
--- a/September/Bulong_Chords_by_Kitchie_Nadal.docx
+++ b/September/Bulong_Chords_by_Kitchie_Nadal.docx
@@ -763,25 +763,7 @@
           <w:sz w:val="22"/>
           <w:szCs w:val="22"/>
         </w:rPr>
-        <w:t xml:space="preserve"> </w:t>
-      </w:r>
-      <w:proofErr w:type="spellStart"/>
-      <w:r>
-        <w:rPr>
-          <w:rFonts w:ascii="Courier New" w:eastAsia="Courier New" w:hAnsi="Courier New" w:cs="Courier New"/>
-          <w:sz w:val="22"/>
-          <w:szCs w:val="22"/>
-        </w:rPr>
-        <w:t>bulong</w:t>
-      </w:r>
-      <w:proofErr w:type="spellEnd"/>
-      <w:r>
-        <w:rPr>
-          <w:rFonts w:ascii="Courier New" w:eastAsia="Courier New" w:hAnsi="Courier New" w:cs="Courier New"/>
-          <w:sz w:val="22"/>
-          <w:szCs w:val="22"/>
-        </w:rPr>
-        <w:t xml:space="preserve"> </w:t>
+        <w:t xml:space="preserve"> bulong </w:t>
       </w:r>
       <w:proofErr w:type="spellStart"/>
       <w:r>
@@ -1489,25 +1471,7 @@
           <w:sz w:val="22"/>
           <w:szCs w:val="22"/>
         </w:rPr>
-        <w:t xml:space="preserve"> </w:t>
-      </w:r>
-      <w:proofErr w:type="spellStart"/>
-      <w:r>
-        <w:rPr>
-          <w:rFonts w:ascii="Courier New" w:eastAsia="Courier New" w:hAnsi="Courier New" w:cs="Courier New"/>
-          <w:sz w:val="22"/>
-          <w:szCs w:val="22"/>
-        </w:rPr>
-        <w:t>bulong</w:t>
-      </w:r>
-      <w:proofErr w:type="spellEnd"/>
-      <w:r>
-        <w:rPr>
-          <w:rFonts w:ascii="Courier New" w:eastAsia="Courier New" w:hAnsi="Courier New" w:cs="Courier New"/>
-          <w:sz w:val="22"/>
-          <w:szCs w:val="22"/>
-        </w:rPr>
-        <w:t xml:space="preserve"> </w:t>
+        <w:t xml:space="preserve"> bulong </w:t>
       </w:r>
       <w:proofErr w:type="spellStart"/>
       <w:r>
@@ -1708,7 +1672,40 @@
           <w:sz w:val="22"/>
           <w:szCs w:val="22"/>
         </w:rPr>
-        <w:t>E             G         Cadd9    G</w:t>
+        <w:t>Bm</w:t>
+      </w:r>
+      <w:r>
+        <w:rPr>
+          <w:rFonts w:ascii="Courier New" w:eastAsia="Courier New" w:hAnsi="Courier New" w:cs="Courier New"/>
+          <w:sz w:val="22"/>
+          <w:szCs w:val="22"/>
+        </w:rPr>
+        <w:t xml:space="preserve">             G        </w:t>
+      </w:r>
+      <w:r>
+        <w:rPr>
+          <w:rFonts w:ascii="Courier New" w:eastAsia="Courier New" w:hAnsi="Courier New" w:cs="Courier New"/>
+          <w:sz w:val="22"/>
+          <w:szCs w:val="22"/>
+        </w:rPr>
+        <w:t>Em</w:t>
+      </w:r>
+      <w:r>
+        <w:rPr>
+          <w:rFonts w:ascii="Courier New" w:eastAsia="Courier New" w:hAnsi="Courier New" w:cs="Courier New"/>
+          <w:sz w:val="22"/>
+          <w:szCs w:val="22"/>
+        </w:rPr>
+        <w:tab/>
+      </w:r>
+      <w:r>
+        <w:rPr>
+          <w:rFonts w:ascii="Courier New" w:eastAsia="Courier New" w:hAnsi="Courier New" w:cs="Courier New"/>
+          <w:sz w:val="22"/>
+          <w:szCs w:val="22"/>
+        </w:rPr>
+        <w:tab/>
+        <w:t>D/F#</w:t>
       </w:r>
     </w:p>
     <w:p>
@@ -1820,7 +1817,48 @@
           <w:sz w:val="22"/>
           <w:szCs w:val="22"/>
         </w:rPr>
-        <w:t xml:space="preserve">        Cadd9               G     D</w:t>
+        <w:t xml:space="preserve">   </w:t>
+      </w:r>
+      <w:r>
+        <w:rPr>
+          <w:rFonts w:ascii="Courier New" w:eastAsia="Courier New" w:hAnsi="Courier New" w:cs="Courier New"/>
+          <w:sz w:val="22"/>
+          <w:szCs w:val="22"/>
+        </w:rPr>
+        <w:t>G</w:t>
+      </w:r>
+      <w:r>
+        <w:rPr>
+          <w:rFonts w:ascii="Courier New" w:eastAsia="Courier New" w:hAnsi="Courier New" w:cs="Courier New"/>
+          <w:sz w:val="22"/>
+          <w:szCs w:val="22"/>
+        </w:rPr>
+        <w:t xml:space="preserve">               </w:t>
+      </w:r>
+      <w:r>
+        <w:rPr>
+          <w:rFonts w:ascii="Courier New" w:eastAsia="Courier New" w:hAnsi="Courier New" w:cs="Courier New"/>
+          <w:sz w:val="22"/>
+          <w:szCs w:val="22"/>
+        </w:rPr>
+        <w:t xml:space="preserve">  </w:t>
+      </w:r>
+      <w:r>
+        <w:rPr>
+          <w:rFonts w:ascii="Courier New" w:eastAsia="Courier New" w:hAnsi="Courier New" w:cs="Courier New"/>
+          <w:sz w:val="22"/>
+          <w:szCs w:val="22"/>
+        </w:rPr>
+        <w:tab/>
+        <w:t xml:space="preserve">    A</w:t>
+      </w:r>
+      <w:r>
+        <w:rPr>
+          <w:rFonts w:ascii="Courier New" w:eastAsia="Courier New" w:hAnsi="Courier New" w:cs="Courier New"/>
+          <w:sz w:val="22"/>
+          <w:szCs w:val="22"/>
+        </w:rPr>
+        <w:t xml:space="preserve">     </w:t>
       </w:r>
     </w:p>
     <w:p>
@@ -2130,25 +2168,7 @@
           <w:sz w:val="22"/>
           <w:szCs w:val="22"/>
         </w:rPr>
-        <w:t xml:space="preserve"> </w:t>
-      </w:r>
-      <w:proofErr w:type="spellStart"/>
-      <w:r>
-        <w:rPr>
-          <w:rFonts w:ascii="Courier New" w:eastAsia="Courier New" w:hAnsi="Courier New" w:cs="Courier New"/>
-          <w:sz w:val="22"/>
-          <w:szCs w:val="22"/>
-        </w:rPr>
-        <w:t>bulong</w:t>
-      </w:r>
-      <w:proofErr w:type="spellEnd"/>
-      <w:r>
-        <w:rPr>
-          <w:rFonts w:ascii="Courier New" w:eastAsia="Courier New" w:hAnsi="Courier New" w:cs="Courier New"/>
-          <w:sz w:val="22"/>
-          <w:szCs w:val="22"/>
-        </w:rPr>
-        <w:t xml:space="preserve"> </w:t>
+        <w:t xml:space="preserve"> bulong </w:t>
       </w:r>
       <w:proofErr w:type="spellStart"/>
       <w:r>
@@ -2408,25 +2428,7 @@
           <w:sz w:val="22"/>
           <w:szCs w:val="22"/>
         </w:rPr>
-        <w:t xml:space="preserve"> </w:t>
-      </w:r>
-      <w:proofErr w:type="spellStart"/>
-      <w:r>
-        <w:rPr>
-          <w:rFonts w:ascii="Courier New" w:eastAsia="Courier New" w:hAnsi="Courier New" w:cs="Courier New"/>
-          <w:sz w:val="22"/>
-          <w:szCs w:val="22"/>
-        </w:rPr>
-        <w:t>bulong</w:t>
-      </w:r>
-      <w:proofErr w:type="spellEnd"/>
-      <w:r>
-        <w:rPr>
-          <w:rFonts w:ascii="Courier New" w:eastAsia="Courier New" w:hAnsi="Courier New" w:cs="Courier New"/>
-          <w:sz w:val="22"/>
-          <w:szCs w:val="22"/>
-        </w:rPr>
-        <w:t xml:space="preserve"> </w:t>
+        <w:t xml:space="preserve"> bulong </w:t>
       </w:r>
       <w:proofErr w:type="spellStart"/>
       <w:r>

</xml_diff>

<commit_message>
Update Bulong's final chorus tail
Per the updated source chord sheet:
- The last two "Ito'y 'di galing..." repeats are now shorter tag lines
  ("Cadd9 G D / patungo sa pangakong paraiso", the second with an
  ellipsis pause) instead of two more full chorus repeats.
- Added a "D E G D" instrumental riff after the tag, before the
  transition into Same Ground.
- Minor wording tweak on the transition note.

Scanned the rest of the doc (Intro, Verse 1/2, both earlier Choruses,
Bridge, both Instrumentals, Interlude) against the current data —
no other changes.

Co-Authored-By: Claude Sonnet 5 <noreply@anthropic.com>
Claude-Session: https://claude.ai/code/session_01VAaiXhx9wytCGGEnHUzCxJ
</commit_message>
<xml_diff>
--- a/September/Bulong_Chords_by_Kitchie_Nadal.docx
+++ b/September/Bulong_Chords_by_Kitchie_Nadal.docx
@@ -95,16 +95,7 @@
           <w:sz w:val="22"/>
           <w:szCs w:val="22"/>
         </w:rPr>
-        <w:t xml:space="preserve">  </w:t>
-      </w:r>
-      <w:proofErr w:type="gramStart"/>
-      <w:r>
-        <w:rPr>
-          <w:rFonts w:ascii="Courier New" w:eastAsia="Courier New" w:hAnsi="Courier New" w:cs="Courier New"/>
-          <w:sz w:val="22"/>
-          <w:szCs w:val="22"/>
-        </w:rPr>
-        <w:t xml:space="preserve">D         </w:t>
+        <w:t xml:space="preserve">  D         </w:t>
       </w:r>
       <w:proofErr w:type="spellStart"/>
       <w:r>
@@ -122,16 +113,7 @@
           <w:sz w:val="22"/>
           <w:szCs w:val="22"/>
         </w:rPr>
-        <w:t xml:space="preserve">      </w:t>
-      </w:r>
-      <w:proofErr w:type="gramEnd"/>
-      <w:r>
-        <w:rPr>
-          <w:rFonts w:ascii="Courier New" w:eastAsia="Courier New" w:hAnsi="Courier New" w:cs="Courier New"/>
-          <w:sz w:val="22"/>
-          <w:szCs w:val="22"/>
-        </w:rPr>
-        <w:t xml:space="preserve"> E   G        C        Cadd9</w:t>
+        <w:t xml:space="preserve">       E   G        C        Cadd9</w:t>
       </w:r>
     </w:p>
     <w:p>
@@ -357,18 +339,8 @@
           <w:sz w:val="22"/>
           <w:szCs w:val="22"/>
         </w:rPr>
-        <w:t xml:space="preserve"> pa ng </w:t>
-      </w:r>
-      <w:proofErr w:type="gramStart"/>
-      <w:r>
-        <w:rPr>
-          <w:rFonts w:ascii="Courier New" w:eastAsia="Courier New" w:hAnsi="Courier New" w:cs="Courier New"/>
-          <w:sz w:val="22"/>
-          <w:szCs w:val="22"/>
-        </w:rPr>
-        <w:t>poot</w:t>
-      </w:r>
-      <w:proofErr w:type="gramEnd"/>
+        <w:t xml:space="preserve"> pa ng poot</w:t>
+      </w:r>
     </w:p>
     <w:p>
       <w:r>
@@ -1672,23 +1644,7 @@
           <w:sz w:val="22"/>
           <w:szCs w:val="22"/>
         </w:rPr>
-        <w:t>Bm</w:t>
-      </w:r>
-      <w:r>
-        <w:rPr>
-          <w:rFonts w:ascii="Courier New" w:eastAsia="Courier New" w:hAnsi="Courier New" w:cs="Courier New"/>
-          <w:sz w:val="22"/>
-          <w:szCs w:val="22"/>
-        </w:rPr>
-        <w:t xml:space="preserve">             G        </w:t>
-      </w:r>
-      <w:r>
-        <w:rPr>
-          <w:rFonts w:ascii="Courier New" w:eastAsia="Courier New" w:hAnsi="Courier New" w:cs="Courier New"/>
-          <w:sz w:val="22"/>
-          <w:szCs w:val="22"/>
-        </w:rPr>
-        <w:t>Em</w:t>
+        <w:t>Bm             G        Em</w:t>
       </w:r>
       <w:r>
         <w:rPr>
@@ -1797,18 +1753,8 @@
           <w:sz w:val="22"/>
           <w:szCs w:val="22"/>
         </w:rPr>
-        <w:t xml:space="preserve"> </w:t>
-      </w:r>
-      <w:proofErr w:type="spellStart"/>
-      <w:r>
-        <w:rPr>
-          <w:rFonts w:ascii="Courier New" w:eastAsia="Courier New" w:hAnsi="Courier New" w:cs="Courier New"/>
-          <w:sz w:val="22"/>
-          <w:szCs w:val="22"/>
-        </w:rPr>
-        <w:t>na</w:t>
-      </w:r>
-      <w:proofErr w:type="spellEnd"/>
+        <w:t xml:space="preserve"> na</w:t>
+      </w:r>
     </w:p>
     <w:p>
       <w:r>
@@ -2603,36 +2549,100 @@
           <w:sz w:val="22"/>
           <w:szCs w:val="22"/>
         </w:rPr>
-        <w:t>D           C           G    Cadd9      G           D</w:t>
-      </w:r>
-    </w:p>
-    <w:p>
-      <w:proofErr w:type="spellStart"/>
-      <w:r>
-        <w:rPr>
-          <w:rFonts w:ascii="Courier New" w:eastAsia="Courier New" w:hAnsi="Courier New" w:cs="Courier New"/>
-          <w:sz w:val="22"/>
-          <w:szCs w:val="22"/>
-        </w:rPr>
-        <w:t>Ito’y</w:t>
-      </w:r>
-      <w:proofErr w:type="spellEnd"/>
-      <w:r>
-        <w:rPr>
-          <w:rFonts w:ascii="Courier New" w:eastAsia="Courier New" w:hAnsi="Courier New" w:cs="Courier New"/>
-          <w:sz w:val="22"/>
-          <w:szCs w:val="22"/>
-        </w:rPr>
-        <w:t xml:space="preserve"> ‘di </w:t>
-      </w:r>
-      <w:proofErr w:type="spellStart"/>
-      <w:r>
-        <w:rPr>
-          <w:rFonts w:ascii="Courier New" w:eastAsia="Courier New" w:hAnsi="Courier New" w:cs="Courier New"/>
-          <w:sz w:val="22"/>
-          <w:szCs w:val="22"/>
-        </w:rPr>
-        <w:t>galing</w:t>
+        <w:t>Cadd9      G           D</w:t>
+      </w:r>
+    </w:p>
+    <w:p>
+      <w:proofErr w:type="spellStart"/>
+      <w:r>
+        <w:rPr>
+          <w:rFonts w:ascii="Courier New" w:eastAsia="Courier New" w:hAnsi="Courier New" w:cs="Courier New"/>
+          <w:sz w:val="22"/>
+          <w:szCs w:val="22"/>
+        </w:rPr>
+        <w:t>patungo</w:t>
+      </w:r>
+      <w:proofErr w:type="spellEnd"/>
+      <w:r>
+        <w:rPr>
+          <w:rFonts w:ascii="Courier New" w:eastAsia="Courier New" w:hAnsi="Courier New" w:cs="Courier New"/>
+          <w:sz w:val="22"/>
+          <w:szCs w:val="22"/>
+        </w:rPr>
+        <w:t xml:space="preserve"> sa </w:t>
+      </w:r>
+      <w:proofErr w:type="spellStart"/>
+      <w:r>
+        <w:rPr>
+          <w:rFonts w:ascii="Courier New" w:eastAsia="Courier New" w:hAnsi="Courier New" w:cs="Courier New"/>
+          <w:sz w:val="22"/>
+          <w:szCs w:val="22"/>
+        </w:rPr>
+        <w:t>pangakong</w:t>
+      </w:r>
+      <w:proofErr w:type="spellEnd"/>
+      <w:r>
+        <w:rPr>
+          <w:rFonts w:ascii="Courier New" w:eastAsia="Courier New" w:hAnsi="Courier New" w:cs="Courier New"/>
+          <w:sz w:val="22"/>
+          <w:szCs w:val="22"/>
+        </w:rPr>
+        <w:t xml:space="preserve"> </w:t>
+      </w:r>
+      <w:proofErr w:type="spellStart"/>
+      <w:r>
+        <w:rPr>
+          <w:rFonts w:ascii="Courier New" w:eastAsia="Courier New" w:hAnsi="Courier New" w:cs="Courier New"/>
+          <w:sz w:val="22"/>
+          <w:szCs w:val="22"/>
+        </w:rPr>
+        <w:t>paraiso</w:t>
+      </w:r>
+      <w:proofErr w:type="spellEnd"/>
+    </w:p>
+    <w:p>
+      <w:r>
+        <w:rPr>
+          <w:rFonts w:ascii="Courier New" w:eastAsia="Courier New" w:hAnsi="Courier New" w:cs="Courier New"/>
+          <w:sz w:val="22"/>
+          <w:szCs w:val="22"/>
+        </w:rPr>
+        <w:t xml:space="preserve">Cadd9      G      </w:t>
+      </w:r>
+      <w:r>
+        <w:rPr>
+          <w:rFonts w:ascii="Courier New" w:eastAsia="Courier New" w:hAnsi="Courier New" w:cs="Courier New"/>
+          <w:sz w:val="22"/>
+          <w:szCs w:val="22"/>
+        </w:rPr>
+        <w:tab/>
+      </w:r>
+      <w:r>
+        <w:rPr>
+          <w:rFonts w:ascii="Courier New" w:eastAsia="Courier New" w:hAnsi="Courier New" w:cs="Courier New"/>
+          <w:sz w:val="22"/>
+          <w:szCs w:val="22"/>
+        </w:rPr>
+        <w:tab/>
+        <w:t>D</w:t>
+      </w:r>
+    </w:p>
+    <w:p>
+      <w:pPr>
+        <w:rPr>
+          <w:rFonts w:ascii="Courier New" w:eastAsia="Courier New" w:hAnsi="Courier New" w:cs="Courier New"/>
+          <w:sz w:val="22"/>
+          <w:szCs w:val="22"/>
+        </w:rPr>
+      </w:pPr>
+      <w:proofErr w:type="spellStart"/>
+      <w:r>
+        <w:rPr>
+          <w:rFonts w:ascii="Courier New" w:eastAsia="Courier New" w:hAnsi="Courier New" w:cs="Courier New"/>
+          <w:sz w:val="22"/>
+          <w:szCs w:val="22"/>
+        </w:rPr>
+        <w:t>patungo</w:t>
       </w:r>
       <w:proofErr w:type="spellEnd"/>
       <w:r>
@@ -2668,60 +2678,6 @@
           <w:sz w:val="22"/>
           <w:szCs w:val="22"/>
         </w:rPr>
-        <w:t>mundo</w:t>
-      </w:r>
-      <w:proofErr w:type="spellEnd"/>
-      <w:r>
-        <w:rPr>
-          <w:rFonts w:ascii="Courier New" w:eastAsia="Courier New" w:hAnsi="Courier New" w:cs="Courier New"/>
-          <w:sz w:val="22"/>
-          <w:szCs w:val="22"/>
-        </w:rPr>
-        <w:t xml:space="preserve"> </w:t>
-      </w:r>
-      <w:proofErr w:type="spellStart"/>
-      <w:r>
-        <w:rPr>
-          <w:rFonts w:ascii="Courier New" w:eastAsia="Courier New" w:hAnsi="Courier New" w:cs="Courier New"/>
-          <w:sz w:val="22"/>
-          <w:szCs w:val="22"/>
-        </w:rPr>
-        <w:t>patungo</w:t>
-      </w:r>
-      <w:proofErr w:type="spellEnd"/>
-      <w:r>
-        <w:rPr>
-          <w:rFonts w:ascii="Courier New" w:eastAsia="Courier New" w:hAnsi="Courier New" w:cs="Courier New"/>
-          <w:sz w:val="22"/>
-          <w:szCs w:val="22"/>
-        </w:rPr>
-        <w:t xml:space="preserve"> </w:t>
-      </w:r>
-      <w:proofErr w:type="spellStart"/>
-      <w:r>
-        <w:rPr>
-          <w:rFonts w:ascii="Courier New" w:eastAsia="Courier New" w:hAnsi="Courier New" w:cs="Courier New"/>
-          <w:sz w:val="22"/>
-          <w:szCs w:val="22"/>
-        </w:rPr>
-        <w:t>sa</w:t>
-      </w:r>
-      <w:proofErr w:type="spellEnd"/>
-      <w:r>
-        <w:rPr>
-          <w:rFonts w:ascii="Courier New" w:eastAsia="Courier New" w:hAnsi="Courier New" w:cs="Courier New"/>
-          <w:sz w:val="22"/>
-          <w:szCs w:val="22"/>
-        </w:rPr>
-        <w:t xml:space="preserve"> </w:t>
-      </w:r>
-      <w:proofErr w:type="spellStart"/>
-      <w:r>
-        <w:rPr>
-          <w:rFonts w:ascii="Courier New" w:eastAsia="Courier New" w:hAnsi="Courier New" w:cs="Courier New"/>
-          <w:sz w:val="22"/>
-          <w:szCs w:val="22"/>
-        </w:rPr>
         <w:t>pangakong</w:t>
       </w:r>
       <w:proofErr w:type="spellEnd"/>
@@ -2733,6 +2689,14 @@
         </w:rPr>
         <w:t xml:space="preserve"> </w:t>
       </w:r>
+      <w:r>
+        <w:rPr>
+          <w:rFonts w:ascii="Courier New" w:eastAsia="Courier New" w:hAnsi="Courier New" w:cs="Courier New"/>
+          <w:sz w:val="22"/>
+          <w:szCs w:val="22"/>
+        </w:rPr>
+        <w:t xml:space="preserve">………… </w:t>
+      </w:r>
       <w:proofErr w:type="spellStart"/>
       <w:r>
         <w:rPr>
@@ -2745,16 +2709,6 @@
       <w:proofErr w:type="spellEnd"/>
     </w:p>
     <w:p>
-      <w:r>
-        <w:rPr>
-          <w:rFonts w:ascii="Courier New" w:eastAsia="Courier New" w:hAnsi="Courier New" w:cs="Courier New"/>
-          <w:sz w:val="22"/>
-          <w:szCs w:val="22"/>
-        </w:rPr>
-        <w:t xml:space="preserve">D           C           G    Cadd9      G      </w:t>
-      </w:r>
-    </w:p>
-    <w:p>
       <w:pPr>
         <w:rPr>
           <w:rFonts w:ascii="Courier New" w:eastAsia="Courier New" w:hAnsi="Courier New" w:cs="Courier New"/>
@@ -2762,132 +2716,6 @@
           <w:szCs w:val="22"/>
         </w:rPr>
       </w:pPr>
-      <w:proofErr w:type="spellStart"/>
-      <w:r>
-        <w:rPr>
-          <w:rFonts w:ascii="Courier New" w:eastAsia="Courier New" w:hAnsi="Courier New" w:cs="Courier New"/>
-          <w:sz w:val="22"/>
-          <w:szCs w:val="22"/>
-        </w:rPr>
-        <w:t>Ito’y</w:t>
-      </w:r>
-      <w:proofErr w:type="spellEnd"/>
-      <w:r>
-        <w:rPr>
-          <w:rFonts w:ascii="Courier New" w:eastAsia="Courier New" w:hAnsi="Courier New" w:cs="Courier New"/>
-          <w:sz w:val="22"/>
-          <w:szCs w:val="22"/>
-        </w:rPr>
-        <w:t xml:space="preserve"> ‘di </w:t>
-      </w:r>
-      <w:proofErr w:type="spellStart"/>
-      <w:r>
-        <w:rPr>
-          <w:rFonts w:ascii="Courier New" w:eastAsia="Courier New" w:hAnsi="Courier New" w:cs="Courier New"/>
-          <w:sz w:val="22"/>
-          <w:szCs w:val="22"/>
-        </w:rPr>
-        <w:t>galing</w:t>
-      </w:r>
-      <w:proofErr w:type="spellEnd"/>
-      <w:r>
-        <w:rPr>
-          <w:rFonts w:ascii="Courier New" w:eastAsia="Courier New" w:hAnsi="Courier New" w:cs="Courier New"/>
-          <w:sz w:val="22"/>
-          <w:szCs w:val="22"/>
-        </w:rPr>
-        <w:t xml:space="preserve"> </w:t>
-      </w:r>
-      <w:proofErr w:type="spellStart"/>
-      <w:r>
-        <w:rPr>
-          <w:rFonts w:ascii="Courier New" w:eastAsia="Courier New" w:hAnsi="Courier New" w:cs="Courier New"/>
-          <w:sz w:val="22"/>
-          <w:szCs w:val="22"/>
-        </w:rPr>
-        <w:t>sa</w:t>
-      </w:r>
-      <w:proofErr w:type="spellEnd"/>
-      <w:r>
-        <w:rPr>
-          <w:rFonts w:ascii="Courier New" w:eastAsia="Courier New" w:hAnsi="Courier New" w:cs="Courier New"/>
-          <w:sz w:val="22"/>
-          <w:szCs w:val="22"/>
-        </w:rPr>
-        <w:t xml:space="preserve"> </w:t>
-      </w:r>
-      <w:proofErr w:type="spellStart"/>
-      <w:r>
-        <w:rPr>
-          <w:rFonts w:ascii="Courier New" w:eastAsia="Courier New" w:hAnsi="Courier New" w:cs="Courier New"/>
-          <w:sz w:val="22"/>
-          <w:szCs w:val="22"/>
-        </w:rPr>
-        <w:t>mundo</w:t>
-      </w:r>
-      <w:proofErr w:type="spellEnd"/>
-      <w:r>
-        <w:rPr>
-          <w:rFonts w:ascii="Courier New" w:eastAsia="Courier New" w:hAnsi="Courier New" w:cs="Courier New"/>
-          <w:sz w:val="22"/>
-          <w:szCs w:val="22"/>
-        </w:rPr>
-        <w:t xml:space="preserve"> </w:t>
-      </w:r>
-      <w:proofErr w:type="spellStart"/>
-      <w:r>
-        <w:rPr>
-          <w:rFonts w:ascii="Courier New" w:eastAsia="Courier New" w:hAnsi="Courier New" w:cs="Courier New"/>
-          <w:sz w:val="22"/>
-          <w:szCs w:val="22"/>
-        </w:rPr>
-        <w:t>patungo</w:t>
-      </w:r>
-      <w:proofErr w:type="spellEnd"/>
-      <w:r>
-        <w:rPr>
-          <w:rFonts w:ascii="Courier New" w:eastAsia="Courier New" w:hAnsi="Courier New" w:cs="Courier New"/>
-          <w:sz w:val="22"/>
-          <w:szCs w:val="22"/>
-        </w:rPr>
-        <w:t xml:space="preserve"> </w:t>
-      </w:r>
-      <w:proofErr w:type="spellStart"/>
-      <w:r>
-        <w:rPr>
-          <w:rFonts w:ascii="Courier New" w:eastAsia="Courier New" w:hAnsi="Courier New" w:cs="Courier New"/>
-          <w:sz w:val="22"/>
-          <w:szCs w:val="22"/>
-        </w:rPr>
-        <w:t>sa</w:t>
-      </w:r>
-      <w:proofErr w:type="spellEnd"/>
-      <w:r>
-        <w:rPr>
-          <w:rFonts w:ascii="Courier New" w:eastAsia="Courier New" w:hAnsi="Courier New" w:cs="Courier New"/>
-          <w:sz w:val="22"/>
-          <w:szCs w:val="22"/>
-        </w:rPr>
-        <w:t xml:space="preserve"> </w:t>
-      </w:r>
-      <w:proofErr w:type="spellStart"/>
-      <w:r>
-        <w:rPr>
-          <w:rFonts w:ascii="Courier New" w:eastAsia="Courier New" w:hAnsi="Courier New" w:cs="Courier New"/>
-          <w:sz w:val="22"/>
-          <w:szCs w:val="22"/>
-        </w:rPr>
-        <w:t>pangakong</w:t>
-      </w:r>
-      <w:proofErr w:type="spellEnd"/>
-      <w:r>
-        <w:rPr>
-          <w:rFonts w:ascii="Courier New" w:eastAsia="Courier New" w:hAnsi="Courier New" w:cs="Courier New"/>
-          <w:sz w:val="22"/>
-          <w:szCs w:val="22"/>
-        </w:rPr>
-        <w:t xml:space="preserve"> </w:t>
-      </w:r>
     </w:p>
     <w:p>
       <w:pPr>
@@ -2899,6 +2727,57 @@
       </w:pPr>
     </w:p>
     <w:p>
+      <w:r>
+        <w:rPr>
+          <w:rFonts w:ascii="Courier New" w:eastAsia="Courier New" w:hAnsi="Courier New" w:cs="Courier New"/>
+          <w:sz w:val="22"/>
+          <w:szCs w:val="22"/>
+        </w:rPr>
+        <w:t xml:space="preserve">  D</w:t>
+      </w:r>
+      <w:r>
+        <w:rPr>
+          <w:rFonts w:ascii="Courier New" w:eastAsia="Courier New" w:hAnsi="Courier New" w:cs="Courier New"/>
+          <w:sz w:val="22"/>
+          <w:szCs w:val="22"/>
+        </w:rPr>
+        <w:tab/>
+      </w:r>
+      <w:r>
+        <w:rPr>
+          <w:rFonts w:ascii="Courier New" w:eastAsia="Courier New" w:hAnsi="Courier New" w:cs="Courier New"/>
+          <w:sz w:val="22"/>
+          <w:szCs w:val="22"/>
+        </w:rPr>
+        <w:t>E</w:t>
+      </w:r>
+      <w:r>
+        <w:rPr>
+          <w:rFonts w:ascii="Courier New" w:eastAsia="Courier New" w:hAnsi="Courier New" w:cs="Courier New"/>
+          <w:sz w:val="22"/>
+          <w:szCs w:val="22"/>
+        </w:rPr>
+        <w:tab/>
+      </w:r>
+      <w:r>
+        <w:rPr>
+          <w:rFonts w:ascii="Courier New" w:eastAsia="Courier New" w:hAnsi="Courier New" w:cs="Courier New"/>
+          <w:sz w:val="22"/>
+          <w:szCs w:val="22"/>
+        </w:rPr>
+        <w:t>G</w:t>
+      </w:r>
+      <w:r>
+        <w:rPr>
+          <w:rFonts w:ascii="Courier New" w:eastAsia="Courier New" w:hAnsi="Courier New" w:cs="Courier New"/>
+          <w:sz w:val="22"/>
+          <w:szCs w:val="22"/>
+        </w:rPr>
+        <w:tab/>
+        <w:t>D</w:t>
+      </w:r>
+    </w:p>
+    <w:p>
       <w:pPr>
         <w:rPr>
           <w:rFonts w:ascii="Courier New" w:eastAsia="Courier New" w:hAnsi="Courier New" w:cs="Courier New"/>
@@ -2906,13 +2785,63 @@
           <w:szCs w:val="22"/>
         </w:rPr>
       </w:pPr>
-      <w:r>
-        <w:rPr>
-          <w:rFonts w:ascii="Courier New" w:eastAsia="Courier New" w:hAnsi="Courier New" w:cs="Courier New"/>
-          <w:sz w:val="22"/>
-          <w:szCs w:val="22"/>
-        </w:rPr>
-        <w:t xml:space="preserve"> (Prepare to transition for Same Ground)</w:t>
+    </w:p>
+    <w:p>
+      <w:pPr>
+        <w:rPr>
+          <w:rFonts w:ascii="Courier New" w:eastAsia="Courier New" w:hAnsi="Courier New" w:cs="Courier New"/>
+          <w:sz w:val="22"/>
+          <w:szCs w:val="22"/>
+        </w:rPr>
+      </w:pPr>
+    </w:p>
+    <w:p>
+      <w:pPr>
+        <w:rPr>
+          <w:rFonts w:ascii="Courier New" w:eastAsia="Courier New" w:hAnsi="Courier New" w:cs="Courier New"/>
+          <w:sz w:val="22"/>
+          <w:szCs w:val="22"/>
+        </w:rPr>
+      </w:pPr>
+      <w:r>
+        <w:rPr>
+          <w:rFonts w:ascii="Courier New" w:eastAsia="Courier New" w:hAnsi="Courier New" w:cs="Courier New"/>
+          <w:sz w:val="22"/>
+          <w:szCs w:val="22"/>
+        </w:rPr>
+        <w:t xml:space="preserve"> (Prepare </w:t>
+      </w:r>
+      <w:r>
+        <w:rPr>
+          <w:rFonts w:ascii="Courier New" w:eastAsia="Courier New" w:hAnsi="Courier New" w:cs="Courier New"/>
+          <w:sz w:val="22"/>
+          <w:szCs w:val="22"/>
+        </w:rPr>
+        <w:t xml:space="preserve">for </w:t>
+      </w:r>
+      <w:r>
+        <w:rPr>
+          <w:rFonts w:ascii="Courier New" w:eastAsia="Courier New" w:hAnsi="Courier New" w:cs="Courier New"/>
+          <w:sz w:val="22"/>
+          <w:szCs w:val="22"/>
+        </w:rPr>
+        <w:t xml:space="preserve">transition </w:t>
+      </w:r>
+      <w:r>
+        <w:rPr>
+          <w:rFonts w:ascii="Courier New" w:eastAsia="Courier New" w:hAnsi="Courier New" w:cs="Courier New"/>
+          <w:sz w:val="22"/>
+          <w:szCs w:val="22"/>
+        </w:rPr>
+        <w:t xml:space="preserve">to </w:t>
+      </w:r>
+      <w:r>
+        <w:rPr>
+          <w:rFonts w:ascii="Courier New" w:eastAsia="Courier New" w:hAnsi="Courier New" w:cs="Courier New"/>
+          <w:sz w:val="22"/>
+          <w:szCs w:val="22"/>
+        </w:rPr>
+        <w:t>Same Ground)</w:t>
       </w:r>
     </w:p>
     <w:p>

</xml_diff>